<commit_message>
fix: generalize CV Studio demo and install final output assets
</commit_message>
<xml_diff>
--- a/private/cv-studio-demo/04_Bluefin_Marieke_van_Dijk.docx
+++ b/private/cv-studio-demo/04_Bluefin_Marieke_van_Dijk.docx
@@ -8,51 +8,75 @@
         <w:jc w:val="center"/>
         <w:tblLayout w:type="fixed"/>
         <w:tblLook w:firstColumn="1" w:firstRow="1" w:lastColumn="0" w:lastRow="0" w:noHBand="0" w:noVBand="1" w:val="04A0"/>
+        <w:tblBorders>
+          <w:top w:val="nil"/>
+          <w:left w:val="nil"/>
+          <w:bottom w:val="nil"/>
+          <w:right w:val="nil"/>
+          <w:insideH w:val="nil"/>
+          <w:insideV w:val="nil"/>
+        </w:tblBorders>
       </w:tblPr>
       <w:tblGrid>
-        <w:gridCol w:w="5464"/>
-        <w:gridCol w:w="5464"/>
+        <w:gridCol w:w="2650"/>
+        <w:gridCol w:w="7690"/>
       </w:tblGrid>
       <w:tr>
+        <w:trPr>
+          <w:trHeight w:val="15048" w:hRule="exact"/>
+        </w:trPr>
         <w:tc>
           <w:tcPr>
-            <w:tcW w:type="dxa" w:w="2952"/>
-            <w:shd w:fill="071C3D"/>
+            <w:tcW w:type="dxa" w:w="2650"/>
+            <w:vAlign w:val="top"/>
+            <w:shd w:fill="009076"/>
             <w:tcMar>
-              <w:top w:w="150" w:type="dxa"/>
-              <w:start w:w="170" w:type="dxa"/>
-              <w:bottom w:w="150" w:type="dxa"/>
-              <w:end w:w="170" w:type="dxa"/>
+              <w:top w:w="125" w:type="dxa"/>
+              <w:start w:w="135" w:type="dxa"/>
+              <w:bottom w:w="100" w:type="dxa"/>
+              <w:end w:w="125" w:type="dxa"/>
             </w:tcMar>
-            <w:vAlign w:val="top"/>
           </w:tcPr>
           <w:p>
-            <w:r/>
-          </w:p>
-          <w:p>
             <w:pPr>
-              <w:spacing w:after="20"/>
-              <w:jc w:val="center"/>
+              <w:spacing w:after="120"/>
             </w:pPr>
             <w:r>
               <w:rPr>
                 <w:rFonts w:ascii="Arial" w:hAnsi="Arial"/>
                 <w:b/>
+                <w:i w:val="0"/>
                 <w:color w:val="FFFFFF"/>
-                <w:sz w:val="24"/>
+                <w:sz w:val="26"/>
+              </w:rPr>
+              <w:t>bluefin</w:t>
+            </w:r>
+          </w:p>
+          <w:p>
+            <w:pPr>
+              <w:spacing w:after="8"/>
+            </w:pPr>
+            <w:r>
+              <w:rPr>
+                <w:rFonts w:ascii="Arial" w:hAnsi="Arial"/>
+                <w:b/>
+                <w:i w:val="0"/>
+                <w:color w:val="FFFFFF"/>
+                <w:sz w:val="20"/>
               </w:rPr>
               <w:t>Marieke van Dijk</w:t>
             </w:r>
           </w:p>
           <w:p>
             <w:pPr>
-              <w:spacing w:after="140"/>
-              <w:jc w:val="center"/>
+              <w:spacing w:after="120"/>
             </w:pPr>
             <w:r>
               <w:rPr>
                 <w:rFonts w:ascii="Arial" w:hAnsi="Arial"/>
-                <w:color w:val="D8E4FF"/>
+                <w:b/>
+                <w:i w:val="0"/>
+                <w:color w:val="D5F2EB"/>
                 <w:sz w:val="16"/>
               </w:rPr>
               <w:t>Senior Controller</w:t>
@@ -60,12 +84,14 @@
           </w:p>
           <w:p>
             <w:pPr>
-              <w:spacing w:before="40" w:after="60"/>
+              <w:keepNext w:val="0"/>
+              <w:spacing w:before="20" w:after="50"/>
             </w:pPr>
             <w:r>
               <w:rPr>
                 <w:rFonts w:ascii="Arial" w:hAnsi="Arial"/>
                 <w:b/>
+                <w:i w:val="0"/>
                 <w:color w:val="FFFFFF"/>
                 <w:sz w:val="16"/>
               </w:rPr>
@@ -74,12 +100,14 @@
           </w:p>
           <w:p>
             <w:pPr>
-              <w:spacing w:after="22"/>
+              <w:spacing w:after="20" w:line="240" w:lineRule="auto"/>
             </w:pPr>
             <w:r>
               <w:rPr>
                 <w:rFonts w:ascii="Arial" w:hAnsi="Arial"/>
-                <w:color w:val="EEF3FF"/>
+                <w:b w:val="0"/>
+                <w:i w:val="0"/>
+                <w:color w:val="F1FFFB"/>
                 <w:sz w:val="14"/>
               </w:rPr>
               <w:t>Utrecht</w:t>
@@ -87,12 +115,14 @@
           </w:p>
           <w:p>
             <w:pPr>
-              <w:spacing w:after="22"/>
+              <w:spacing w:after="20" w:line="240" w:lineRule="auto"/>
             </w:pPr>
             <w:r>
               <w:rPr>
                 <w:rFonts w:ascii="Arial" w:hAnsi="Arial"/>
-                <w:color w:val="EEF3FF"/>
+                <w:b w:val="0"/>
+                <w:i w:val="0"/>
+                <w:color w:val="F1FFFB"/>
                 <w:sz w:val="14"/>
               </w:rPr>
               <w:t>+31 6 41 82 73 90</w:t>
@@ -100,12 +130,14 @@
           </w:p>
           <w:p>
             <w:pPr>
-              <w:spacing w:after="22"/>
+              <w:spacing w:after="20" w:line="240" w:lineRule="auto"/>
             </w:pPr>
             <w:r>
               <w:rPr>
                 <w:rFonts w:ascii="Arial" w:hAnsi="Arial"/>
-                <w:color w:val="EEF3FF"/>
+                <w:b w:val="0"/>
+                <w:i w:val="0"/>
+                <w:color w:val="F1FFFB"/>
                 <w:sz w:val="14"/>
               </w:rPr>
               <w:t>marieke.vandijk.demo@example.com</w:t>
@@ -113,12 +145,14 @@
           </w:p>
           <w:p>
             <w:pPr>
-              <w:spacing w:after="22"/>
+              <w:spacing w:after="20" w:line="240" w:lineRule="auto"/>
             </w:pPr>
             <w:r>
               <w:rPr>
                 <w:rFonts w:ascii="Arial" w:hAnsi="Arial"/>
-                <w:color w:val="EEF3FF"/>
+                <w:b w:val="0"/>
+                <w:i w:val="0"/>
+                <w:color w:val="F1FFFB"/>
                 <w:sz w:val="14"/>
               </w:rPr>
               <w:t>linkedin.com/in/marieke-vandijk-demo</w:t>
@@ -126,20 +160,22 @@
           </w:p>
           <w:p>
             <w:pPr>
-              <w:spacing w:after="60"/>
+              <w:spacing w:before="20" w:after="80" w:line="240" w:lineRule="auto"/>
               <w:pBdr>
-                <w:bottom w:val="single" w:sz="4" w:space="1" w:color="365174"/>
+                <w:bottom w:val="single" w:sz="5" w:space="1" w:color="64C4B2"/>
               </w:pBdr>
             </w:pPr>
           </w:p>
           <w:p>
             <w:pPr>
-              <w:spacing w:before="40" w:after="60"/>
+              <w:keepNext w:val="0"/>
+              <w:spacing w:before="20" w:after="50"/>
             </w:pPr>
             <w:r>
               <w:rPr>
                 <w:rFonts w:ascii="Arial" w:hAnsi="Arial"/>
                 <w:b/>
+                <w:i w:val="0"/>
                 <w:color w:val="FFFFFF"/>
                 <w:sz w:val="16"/>
               </w:rPr>
@@ -148,12 +184,44 @@
           </w:p>
           <w:p>
             <w:pPr>
-              <w:spacing w:after="20"/>
+              <w:spacing w:after="18" w:line="240" w:lineRule="auto"/>
             </w:pPr>
             <w:r>
               <w:rPr>
                 <w:rFonts w:ascii="Arial" w:hAnsi="Arial"/>
-                <w:color w:val="EEF3FF"/>
+                <w:b w:val="0"/>
+                <w:i w:val="0"/>
+                <w:color w:val="F1FFFB"/>
+                <w:sz w:val="14"/>
+              </w:rPr>
+              <w:t>Financial control</w:t>
+            </w:r>
+          </w:p>
+          <w:p>
+            <w:pPr>
+              <w:spacing w:after="18" w:line="240" w:lineRule="auto"/>
+            </w:pPr>
+            <w:r>
+              <w:rPr>
+                <w:rFonts w:ascii="Arial" w:hAnsi="Arial"/>
+                <w:b w:val="0"/>
+                <w:i w:val="0"/>
+                <w:color w:val="F1FFFB"/>
+                <w:sz w:val="14"/>
+              </w:rPr>
+              <w:t>Business control</w:t>
+            </w:r>
+          </w:p>
+          <w:p>
+            <w:pPr>
+              <w:spacing w:after="18" w:line="240" w:lineRule="auto"/>
+            </w:pPr>
+            <w:r>
+              <w:rPr>
+                <w:rFonts w:ascii="Arial" w:hAnsi="Arial"/>
+                <w:b w:val="0"/>
+                <w:i w:val="0"/>
+                <w:color w:val="F1FFFB"/>
                 <w:sz w:val="14"/>
               </w:rPr>
               <w:t>Dutch GAAP</w:t>
@@ -161,51 +229,59 @@
           </w:p>
           <w:p>
             <w:pPr>
-              <w:spacing w:after="20"/>
+              <w:spacing w:after="18" w:line="240" w:lineRule="auto"/>
             </w:pPr>
             <w:r>
               <w:rPr>
                 <w:rFonts w:ascii="Arial" w:hAnsi="Arial"/>
-                <w:color w:val="EEF3FF"/>
+                <w:b w:val="0"/>
+                <w:i w:val="0"/>
+                <w:color w:val="F1FFFB"/>
                 <w:sz w:val="14"/>
               </w:rPr>
-              <w:t>Maand-, kwartaal- en jaarafsluiting</w:t>
+              <w:t>Forecasting</w:t>
             </w:r>
           </w:p>
           <w:p>
             <w:pPr>
-              <w:spacing w:after="20"/>
+              <w:spacing w:after="18" w:line="240" w:lineRule="auto"/>
             </w:pPr>
             <w:r>
               <w:rPr>
                 <w:rFonts w:ascii="Arial" w:hAnsi="Arial"/>
-                <w:color w:val="EEF3FF"/>
+                <w:b w:val="0"/>
+                <w:i w:val="0"/>
+                <w:color w:val="F1FFFB"/>
                 <w:sz w:val="14"/>
               </w:rPr>
-              <w:t>Budgettering &amp; forecasting</w:t>
+              <w:t>Management reporting</w:t>
             </w:r>
           </w:p>
           <w:p>
             <w:pPr>
-              <w:spacing w:after="20"/>
+              <w:spacing w:after="18" w:line="240" w:lineRule="auto"/>
             </w:pPr>
             <w:r>
               <w:rPr>
                 <w:rFonts w:ascii="Arial" w:hAnsi="Arial"/>
-                <w:color w:val="EEF3FF"/>
+                <w:b w:val="0"/>
+                <w:i w:val="0"/>
+                <w:color w:val="F1FFFB"/>
                 <w:sz w:val="14"/>
               </w:rPr>
-              <w:t>KPI- en margeanalyse</w:t>
+              <w:t>KPI-analyse</w:t>
             </w:r>
           </w:p>
           <w:p>
             <w:pPr>
-              <w:spacing w:after="20"/>
+              <w:spacing w:after="18" w:line="240" w:lineRule="auto"/>
             </w:pPr>
             <w:r>
               <w:rPr>
                 <w:rFonts w:ascii="Arial" w:hAnsi="Arial"/>
-                <w:color w:val="EEF3FF"/>
+                <w:b w:val="0"/>
+                <w:i w:val="0"/>
+                <w:color w:val="F1FFFB"/>
                 <w:sz w:val="14"/>
               </w:rPr>
               <w:t>Businesscases</w:t>
@@ -213,46 +289,22 @@
           </w:p>
           <w:p>
             <w:pPr>
-              <w:spacing w:after="20"/>
-            </w:pPr>
-            <w:r>
-              <w:rPr>
-                <w:rFonts w:ascii="Arial" w:hAnsi="Arial"/>
-                <w:color w:val="EEF3FF"/>
-                <w:sz w:val="14"/>
-              </w:rPr>
-              <w:t>Audit &amp; compliance</w:t>
-            </w:r>
-          </w:p>
-          <w:p>
-            <w:pPr>
-              <w:spacing w:after="20"/>
-            </w:pPr>
-            <w:r>
-              <w:rPr>
-                <w:rFonts w:ascii="Arial" w:hAnsi="Arial"/>
-                <w:color w:val="EEF3FF"/>
-                <w:sz w:val="14"/>
-              </w:rPr>
-              <w:t>Excel / Power BI</w:t>
-            </w:r>
-          </w:p>
-          <w:p>
-            <w:pPr>
-              <w:spacing w:after="60"/>
+              <w:spacing w:before="20" w:after="80" w:line="240" w:lineRule="auto"/>
               <w:pBdr>
-                <w:bottom w:val="single" w:sz="4" w:space="1" w:color="365174"/>
+                <w:bottom w:val="single" w:sz="5" w:space="1" w:color="64C4B2"/>
               </w:pBdr>
             </w:pPr>
           </w:p>
           <w:p>
             <w:pPr>
-              <w:spacing w:before="40" w:after="60"/>
+              <w:keepNext w:val="0"/>
+              <w:spacing w:before="20" w:after="50"/>
             </w:pPr>
             <w:r>
               <w:rPr>
                 <w:rFonts w:ascii="Arial" w:hAnsi="Arial"/>
                 <w:b/>
+                <w:i w:val="0"/>
                 <w:color w:val="FFFFFF"/>
                 <w:sz w:val="16"/>
               </w:rPr>
@@ -261,12 +313,14 @@
           </w:p>
           <w:p>
             <w:pPr>
-              <w:spacing w:after="20"/>
+              <w:spacing w:after="19" w:line="240" w:lineRule="auto"/>
             </w:pPr>
             <w:r>
               <w:rPr>
                 <w:rFonts w:ascii="Arial" w:hAnsi="Arial"/>
-                <w:color w:val="EEF3FF"/>
+                <w:b w:val="0"/>
+                <w:i w:val="0"/>
+                <w:color w:val="F1FFFB"/>
                 <w:sz w:val="14"/>
               </w:rPr>
               <w:t>Excel</w:t>
@@ -274,12 +328,14 @@
           </w:p>
           <w:p>
             <w:pPr>
-              <w:spacing w:after="20"/>
+              <w:spacing w:after="19" w:line="240" w:lineRule="auto"/>
             </w:pPr>
             <w:r>
               <w:rPr>
                 <w:rFonts w:ascii="Arial" w:hAnsi="Arial"/>
-                <w:color w:val="EEF3FF"/>
+                <w:b w:val="0"/>
+                <w:i w:val="0"/>
+                <w:color w:val="F1FFFB"/>
                 <w:sz w:val="14"/>
               </w:rPr>
               <w:t>Power BI</w:t>
@@ -287,12 +343,14 @@
           </w:p>
           <w:p>
             <w:pPr>
-              <w:spacing w:after="20"/>
+              <w:spacing w:after="19" w:line="240" w:lineRule="auto"/>
             </w:pPr>
             <w:r>
               <w:rPr>
                 <w:rFonts w:ascii="Arial" w:hAnsi="Arial"/>
-                <w:color w:val="EEF3FF"/>
+                <w:b w:val="0"/>
+                <w:i w:val="0"/>
+                <w:color w:val="F1FFFB"/>
                 <w:sz w:val="14"/>
               </w:rPr>
               <w:t>SAP S/4HANA</w:t>
@@ -300,20 +358,22 @@
           </w:p>
           <w:p>
             <w:pPr>
-              <w:spacing w:after="60"/>
+              <w:spacing w:before="20" w:after="80" w:line="240" w:lineRule="auto"/>
               <w:pBdr>
-                <w:bottom w:val="single" w:sz="4" w:space="1" w:color="365174"/>
+                <w:bottom w:val="single" w:sz="5" w:space="1" w:color="64C4B2"/>
               </w:pBdr>
             </w:pPr>
           </w:p>
           <w:p>
             <w:pPr>
-              <w:spacing w:before="40" w:after="60"/>
+              <w:keepNext w:val="0"/>
+              <w:spacing w:before="20" w:after="50"/>
             </w:pPr>
             <w:r>
               <w:rPr>
                 <w:rFonts w:ascii="Arial" w:hAnsi="Arial"/>
                 <w:b/>
+                <w:i w:val="0"/>
                 <w:color w:val="FFFFFF"/>
                 <w:sz w:val="16"/>
               </w:rPr>
@@ -322,12 +382,13 @@
           </w:p>
           <w:p>
             <w:pPr>
-              <w:spacing w:after="20"/>
+              <w:spacing w:after="19"/>
             </w:pPr>
             <w:r>
               <w:rPr>
                 <w:rFonts w:ascii="Arial" w:hAnsi="Arial"/>
                 <w:b/>
+                <w:i w:val="0"/>
                 <w:color w:val="FFFFFF"/>
                 <w:sz w:val="14"/>
               </w:rPr>
@@ -336,7 +397,9 @@
             <w:r>
               <w:rPr>
                 <w:rFonts w:ascii="Arial" w:hAnsi="Arial"/>
-                <w:color w:val="D8E4FF"/>
+                <w:b w:val="0"/>
+                <w:i w:val="0"/>
+                <w:color w:val="F1FFFB"/>
                 <w:sz w:val="14"/>
               </w:rPr>
               <w:t xml:space="preserve"> - Moedertaal</w:t>
@@ -344,12 +407,13 @@
           </w:p>
           <w:p>
             <w:pPr>
-              <w:spacing w:after="20"/>
+              <w:spacing w:after="19"/>
             </w:pPr>
             <w:r>
               <w:rPr>
                 <w:rFonts w:ascii="Arial" w:hAnsi="Arial"/>
                 <w:b/>
+                <w:i w:val="0"/>
                 <w:color w:val="FFFFFF"/>
                 <w:sz w:val="14"/>
               </w:rPr>
@@ -358,28 +422,96 @@
             <w:r>
               <w:rPr>
                 <w:rFonts w:ascii="Arial" w:hAnsi="Arial"/>
-                <w:color w:val="D8E4FF"/>
+                <w:b w:val="0"/>
+                <w:i w:val="0"/>
+                <w:color w:val="F1FFFB"/>
                 <w:sz w:val="14"/>
               </w:rPr>
               <w:t xml:space="preserve"> - Vloeiend</w:t>
             </w:r>
           </w:p>
+          <w:p>
+            <w:pPr>
+              <w:spacing w:before="20" w:after="80" w:line="240" w:lineRule="auto"/>
+              <w:pBdr>
+                <w:bottom w:val="single" w:sz="5" w:space="1" w:color="64C4B2"/>
+              </w:pBdr>
+            </w:pPr>
+          </w:p>
+          <w:p>
+            <w:pPr>
+              <w:keepNext w:val="0"/>
+              <w:spacing w:before="20" w:after="50"/>
+            </w:pPr>
+            <w:r>
+              <w:rPr>
+                <w:rFonts w:ascii="Arial" w:hAnsi="Arial"/>
+                <w:b/>
+                <w:i w:val="0"/>
+                <w:color w:val="FFFFFF"/>
+                <w:sz w:val="16"/>
+              </w:rPr>
+              <w:t>BESCHIKBAARHEID</w:t>
+            </w:r>
+          </w:p>
+          <w:p>
+            <w:pPr>
+              <w:spacing w:after="19" w:line="240" w:lineRule="auto"/>
+            </w:pPr>
+            <w:r>
+              <w:rPr>
+                <w:rFonts w:ascii="Arial" w:hAnsi="Arial"/>
+                <w:b w:val="0"/>
+                <w:i w:val="0"/>
+                <w:color w:val="F1FFFB"/>
+                <w:sz w:val="14"/>
+              </w:rPr>
+              <w:t>36-40 uur</w:t>
+            </w:r>
+          </w:p>
+          <w:p>
+            <w:pPr>
+              <w:spacing w:after="19" w:line="240" w:lineRule="auto"/>
+            </w:pPr>
+            <w:r>
+              <w:rPr>
+                <w:rFonts w:ascii="Arial" w:hAnsi="Arial"/>
+                <w:b w:val="0"/>
+                <w:i w:val="0"/>
+                <w:color w:val="F1FFFB"/>
+                <w:sz w:val="14"/>
+              </w:rPr>
+              <w:t>Hybride werken</w:t>
+            </w:r>
+          </w:p>
+          <w:p>
+            <w:pPr>
+              <w:spacing w:after="19" w:line="240" w:lineRule="auto"/>
+            </w:pPr>
+            <w:r>
+              <w:rPr>
+                <w:rFonts w:ascii="Arial" w:hAnsi="Arial"/>
+                <w:b w:val="0"/>
+                <w:i w:val="0"/>
+                <w:color w:val="F1FFFB"/>
+                <w:sz w:val="14"/>
+              </w:rPr>
+              <w:t>Regio Utrecht / Amersfoort</w:t>
+            </w:r>
+          </w:p>
         </w:tc>
         <w:tc>
           <w:tcPr>
-            <w:tcW w:type="dxa" w:w="7560"/>
+            <w:tcW w:type="dxa" w:w="7690"/>
+            <w:vAlign w:val="top"/>
             <w:shd w:fill="FFFFFF"/>
             <w:tcMar>
               <w:top w:w="110" w:type="dxa"/>
-              <w:start w:w="190" w:type="dxa"/>
-              <w:bottom w:w="100" w:type="dxa"/>
-              <w:end w:w="140" w:type="dxa"/>
+              <w:start w:w="155" w:type="dxa"/>
+              <w:bottom w:w="80" w:type="dxa"/>
+              <w:end w:w="155" w:type="dxa"/>
             </w:tcMar>
-            <w:vAlign w:val="top"/>
           </w:tcPr>
-          <w:p>
-            <w:r/>
-          </w:p>
           <w:p>
             <w:pPr>
               <w:spacing w:after="0"/>
@@ -388,8 +520,9 @@
               <w:rPr>
                 <w:rFonts w:ascii="Arial" w:hAnsi="Arial"/>
                 <w:b/>
-                <w:color w:val="071C3D"/>
-                <w:sz w:val="39"/>
+                <w:i w:val="0"/>
+                <w:color w:val="1B3C51"/>
+                <w:sz w:val="37"/>
               </w:rPr>
               <w:t>Marieke van Dijk</w:t>
             </w:r>
@@ -402,7 +535,8 @@
               <w:rPr>
                 <w:rFonts w:ascii="Arial" w:hAnsi="Arial"/>
                 <w:b/>
-                <w:color w:val="2E6BE6"/>
+                <w:i w:val="0"/>
+                <w:color w:val="0095D1"/>
                 <w:sz w:val="19"/>
               </w:rPr>
               <w:t>Senior Controller</w:t>
@@ -410,34 +544,316 @@
           </w:p>
           <w:p>
             <w:pPr>
-              <w:spacing w:after="80" w:line="240" w:lineRule="auto"/>
+              <w:keepNext w:val="0"/>
+              <w:spacing w:before="20" w:after="50"/>
             </w:pPr>
             <w:r>
               <w:rPr>
                 <w:rFonts w:ascii="Arial" w:hAnsi="Arial"/>
-                <w:color w:val="42506A"/>
-                <w:sz w:val="15"/>
+                <w:b/>
+                <w:i w:val="0"/>
+                <w:color w:val="1B3C51"/>
+                <w:sz w:val="18"/>
               </w:rPr>
-              <w:t>Ervaren controller met ruim acht jaar ervaring in financial control en business control binnen internationale groeiorganisaties. Sterk in maandafsluitingen, managementrapportages, forecasting en het vertalen van financiële data naar concrete stuurinformatie voor management en business.</w:t>
+              <w:t>PROFIEL</w:t>
             </w:r>
           </w:p>
           <w:p>
             <w:pPr>
-              <w:spacing w:after="60"/>
+              <w:keepNext w:val="0"/>
+              <w:keepLines w:val="0"/>
+              <w:spacing w:after="18" w:line="240" w:lineRule="auto"/>
+              <w:ind w:left="187" w:hanging="130"/>
+            </w:pPr>
+            <w:r>
+              <w:rPr>
+                <w:rFonts w:ascii="Arial" w:hAnsi="Arial"/>
+                <w:b/>
+                <w:i w:val="0"/>
+                <w:color w:val="009076"/>
+                <w:sz w:val="17"/>
+              </w:rPr>
+              <w:t xml:space="preserve">• </w:t>
+            </w:r>
+            <w:r>
+              <w:rPr>
+                <w:rFonts w:ascii="Arial" w:hAnsi="Arial"/>
+                <w:b w:val="0"/>
+                <w:i w:val="0"/>
+                <w:color w:val="203550"/>
+                <w:sz w:val="17"/>
+              </w:rPr>
+              <w:t>Senior Controller met 8+ jaar ervaring in financial control en business control binnen internationale groeiorganisaties.</w:t>
+            </w:r>
+          </w:p>
+          <w:p>
+            <w:pPr>
+              <w:keepNext w:val="0"/>
+              <w:keepLines w:val="0"/>
+              <w:spacing w:after="18" w:line="240" w:lineRule="auto"/>
+              <w:ind w:left="187" w:hanging="130"/>
+            </w:pPr>
+            <w:r>
+              <w:rPr>
+                <w:rFonts w:ascii="Arial" w:hAnsi="Arial"/>
+                <w:b/>
+                <w:i w:val="0"/>
+                <w:color w:val="009076"/>
+                <w:sz w:val="17"/>
+              </w:rPr>
+              <w:t xml:space="preserve">• </w:t>
+            </w:r>
+            <w:r>
+              <w:rPr>
+                <w:rFonts w:ascii="Arial" w:hAnsi="Arial"/>
+                <w:b w:val="0"/>
+                <w:i w:val="0"/>
+                <w:color w:val="203550"/>
+                <w:sz w:val="17"/>
+              </w:rPr>
+              <w:t>Combineert betrouwbare afsluitingen en rapportages met scherpe analyses van omzet, marge, KPI's en forecasts.</w:t>
+            </w:r>
+          </w:p>
+          <w:p>
+            <w:pPr>
+              <w:keepNext w:val="0"/>
+              <w:keepLines w:val="0"/>
+              <w:spacing w:after="18" w:line="240" w:lineRule="auto"/>
+              <w:ind w:left="187" w:hanging="130"/>
+            </w:pPr>
+            <w:r>
+              <w:rPr>
+                <w:rFonts w:ascii="Arial" w:hAnsi="Arial"/>
+                <w:b/>
+                <w:i w:val="0"/>
+                <w:color w:val="009076"/>
+                <w:sz w:val="17"/>
+              </w:rPr>
+              <w:t xml:space="preserve">• </w:t>
+            </w:r>
+            <w:r>
+              <w:rPr>
+                <w:rFonts w:ascii="Arial" w:hAnsi="Arial"/>
+                <w:b w:val="0"/>
+                <w:i w:val="0"/>
+                <w:color w:val="203550"/>
+                <w:sz w:val="17"/>
+              </w:rPr>
+              <w:t>Ervaren sparringpartner voor management en commercie, met een sterke basis in Dutch GAAP, audit en procesverbetering.</w:t>
+            </w:r>
+          </w:p>
+          <w:p>
+            <w:pPr>
+              <w:spacing w:before="20" w:after="64" w:line="240" w:lineRule="auto"/>
               <w:pBdr>
-                <w:bottom w:val="single" w:sz="4" w:space="1" w:color="D6DDEA"/>
+                <w:bottom w:val="single" w:sz="5" w:space="1" w:color="A7D9CF"/>
               </w:pBdr>
             </w:pPr>
           </w:p>
           <w:p>
             <w:pPr>
-              <w:spacing w:before="40" w:after="60"/>
+              <w:keepNext w:val="0"/>
+              <w:spacing w:before="20" w:after="50"/>
+              <w:shd w:fill="EAF7F4"/>
             </w:pPr>
             <w:r>
               <w:rPr>
                 <w:rFonts w:ascii="Arial" w:hAnsi="Arial"/>
                 <w:b/>
-                <w:color w:val="071C3D"/>
+                <w:i w:val="0"/>
+                <w:color w:val="E27D2B"/>
+                <w:sz w:val="18"/>
+              </w:rPr>
+              <w:t>MATCH MET SENIOR CONTROLLER - LEASE A BIKE</w:t>
+            </w:r>
+          </w:p>
+          <w:p>
+            <w:pPr>
+              <w:keepNext w:val="0"/>
+              <w:keepLines w:val="0"/>
+              <w:spacing w:after="12" w:line="240" w:lineRule="auto"/>
+              <w:ind w:left="187" w:hanging="130"/>
+            </w:pPr>
+            <w:r>
+              <w:rPr>
+                <w:rFonts w:ascii="Arial" w:hAnsi="Arial"/>
+                <w:b/>
+                <w:i w:val="0"/>
+                <w:color w:val="009076"/>
+                <w:sz w:val="16"/>
+              </w:rPr>
+              <w:t xml:space="preserve">• </w:t>
+            </w:r>
+            <w:r>
+              <w:rPr>
+                <w:rFonts w:ascii="Arial" w:hAnsi="Arial"/>
+                <w:b w:val="0"/>
+                <w:i w:val="0"/>
+                <w:color w:val="203550"/>
+                <w:sz w:val="16"/>
+              </w:rPr>
+              <w:t>8+ jaar relevante controlervaring</w:t>
+            </w:r>
+          </w:p>
+          <w:p>
+            <w:pPr>
+              <w:keepNext w:val="0"/>
+              <w:keepLines w:val="0"/>
+              <w:spacing w:after="12" w:line="240" w:lineRule="auto"/>
+              <w:ind w:left="187" w:hanging="130"/>
+            </w:pPr>
+            <w:r>
+              <w:rPr>
+                <w:rFonts w:ascii="Arial" w:hAnsi="Arial"/>
+                <w:b/>
+                <w:i w:val="0"/>
+                <w:color w:val="009076"/>
+                <w:sz w:val="16"/>
+              </w:rPr>
+              <w:t xml:space="preserve">• </w:t>
+            </w:r>
+            <w:r>
+              <w:rPr>
+                <w:rFonts w:ascii="Arial" w:hAnsi="Arial"/>
+                <w:b w:val="0"/>
+                <w:i w:val="0"/>
+                <w:color w:val="203550"/>
+                <w:sz w:val="16"/>
+              </w:rPr>
+              <w:t>Financial én business control</w:t>
+            </w:r>
+          </w:p>
+          <w:p>
+            <w:pPr>
+              <w:keepNext w:val="0"/>
+              <w:keepLines w:val="0"/>
+              <w:spacing w:after="12" w:line="240" w:lineRule="auto"/>
+              <w:ind w:left="187" w:hanging="130"/>
+            </w:pPr>
+            <w:r>
+              <w:rPr>
+                <w:rFonts w:ascii="Arial" w:hAnsi="Arial"/>
+                <w:b/>
+                <w:i w:val="0"/>
+                <w:color w:val="009076"/>
+                <w:sz w:val="16"/>
+              </w:rPr>
+              <w:t xml:space="preserve">• </w:t>
+            </w:r>
+            <w:r>
+              <w:rPr>
+                <w:rFonts w:ascii="Arial" w:hAnsi="Arial"/>
+                <w:b w:val="0"/>
+                <w:i w:val="0"/>
+                <w:color w:val="203550"/>
+                <w:sz w:val="16"/>
+              </w:rPr>
+              <w:t>Dutch GAAP &amp; audit</w:t>
+            </w:r>
+          </w:p>
+          <w:p>
+            <w:pPr>
+              <w:keepNext w:val="0"/>
+              <w:keepLines w:val="0"/>
+              <w:spacing w:after="12" w:line="240" w:lineRule="auto"/>
+              <w:ind w:left="187" w:hanging="130"/>
+            </w:pPr>
+            <w:r>
+              <w:rPr>
+                <w:rFonts w:ascii="Arial" w:hAnsi="Arial"/>
+                <w:b/>
+                <w:i w:val="0"/>
+                <w:color w:val="009076"/>
+                <w:sz w:val="16"/>
+              </w:rPr>
+              <w:t xml:space="preserve">• </w:t>
+            </w:r>
+            <w:r>
+              <w:rPr>
+                <w:rFonts w:ascii="Arial" w:hAnsi="Arial"/>
+                <w:b w:val="0"/>
+                <w:i w:val="0"/>
+                <w:color w:val="203550"/>
+                <w:sz w:val="16"/>
+              </w:rPr>
+              <w:t>Budgettering en rolling forecast</w:t>
+            </w:r>
+          </w:p>
+          <w:p>
+            <w:pPr>
+              <w:keepNext w:val="0"/>
+              <w:keepLines w:val="0"/>
+              <w:spacing w:after="12" w:line="240" w:lineRule="auto"/>
+              <w:ind w:left="187" w:hanging="130"/>
+            </w:pPr>
+            <w:r>
+              <w:rPr>
+                <w:rFonts w:ascii="Arial" w:hAnsi="Arial"/>
+                <w:b/>
+                <w:i w:val="0"/>
+                <w:color w:val="009076"/>
+                <w:sz w:val="16"/>
+              </w:rPr>
+              <w:t xml:space="preserve">• </w:t>
+            </w:r>
+            <w:r>
+              <w:rPr>
+                <w:rFonts w:ascii="Arial" w:hAnsi="Arial"/>
+                <w:b w:val="0"/>
+                <w:i w:val="0"/>
+                <w:color w:val="203550"/>
+                <w:sz w:val="16"/>
+              </w:rPr>
+              <w:t>KPI-, marge- en rendementsanalyse</w:t>
+            </w:r>
+          </w:p>
+          <w:p>
+            <w:pPr>
+              <w:keepNext w:val="0"/>
+              <w:keepLines w:val="0"/>
+              <w:spacing w:after="12" w:line="240" w:lineRule="auto"/>
+              <w:ind w:left="187" w:hanging="130"/>
+            </w:pPr>
+            <w:r>
+              <w:rPr>
+                <w:rFonts w:ascii="Arial" w:hAnsi="Arial"/>
+                <w:b/>
+                <w:i w:val="0"/>
+                <w:color w:val="009076"/>
+                <w:sz w:val="16"/>
+              </w:rPr>
+              <w:t xml:space="preserve">• </w:t>
+            </w:r>
+            <w:r>
+              <w:rPr>
+                <w:rFonts w:ascii="Arial" w:hAnsi="Arial"/>
+                <w:b w:val="0"/>
+                <w:i w:val="0"/>
+                <w:color w:val="203550"/>
+                <w:sz w:val="16"/>
+              </w:rPr>
+              <w:t>Businesscases en managementadvies</w:t>
+            </w:r>
+          </w:p>
+          <w:p>
+            <w:pPr>
+              <w:spacing w:before="20" w:after="64" w:line="240" w:lineRule="auto"/>
+              <w:pBdr>
+                <w:bottom w:val="single" w:sz="5" w:space="1" w:color="A7D9CF"/>
+              </w:pBdr>
+            </w:pPr>
+          </w:p>
+          <w:p>
+            <w:pPr>
+              <w:keepNext w:val="0"/>
+              <w:spacing w:before="20" w:after="50"/>
+            </w:pPr>
+            <w:r>
+              <w:rPr>
+                <w:rFonts w:ascii="Arial" w:hAnsi="Arial"/>
+                <w:b/>
+                <w:i w:val="0"/>
+                <w:color w:val="1B3C51"/>
                 <w:sz w:val="18"/>
               </w:rPr>
               <w:t>WERKERVARING</w:t>
@@ -445,491 +861,777 @@
           </w:p>
           <w:p>
             <w:pPr>
-              <w:spacing w:after="4"/>
+              <w:spacing w:after="5"/>
             </w:pPr>
             <w:r>
               <w:rPr>
                 <w:rFonts w:ascii="Arial" w:hAnsi="Arial"/>
                 <w:b/>
-                <w:color w:val="071C3D"/>
-                <w:sz w:val="16"/>
+                <w:i w:val="0"/>
+                <w:color w:val="1B3C51"/>
+                <w:sz w:val="17"/>
               </w:rPr>
               <w:t>Senior Controller</w:t>
             </w:r>
             <w:r>
               <w:rPr>
                 <w:rFonts w:ascii="Arial" w:hAnsi="Arial"/>
-                <w:color w:val="6D7890"/>
-                <w:sz w:val="13"/>
+                <w:b w:val="0"/>
+                <w:i w:val="0"/>
+                <w:color w:val="6A7882"/>
+                <w:sz w:val="15"/>
               </w:rPr>
-              <w:t xml:space="preserve">   2022 - heden</w:t>
+              <w:t xml:space="preserve">  2022 - heden</w:t>
             </w:r>
           </w:p>
           <w:p>
             <w:pPr>
-              <w:spacing w:after="14"/>
+              <w:spacing w:after="15"/>
             </w:pPr>
             <w:r>
               <w:rPr>
                 <w:rFonts w:ascii="Arial" w:hAnsi="Arial"/>
                 <w:b/>
-                <w:color w:val="2E6BE6"/>
-                <w:sz w:val="14"/>
+                <w:i w:val="0"/>
+                <w:color w:val="009076"/>
+                <w:sz w:val="15"/>
               </w:rPr>
               <w:t>Velora Mobility Europe B.V. - Utrecht</w:t>
             </w:r>
           </w:p>
           <w:p>
             <w:pPr>
-              <w:spacing w:after="9" w:line="240" w:lineRule="auto"/>
-              <w:ind w:left="187" w:hanging="115"/>
+              <w:keepNext w:val="0"/>
+              <w:keepLines w:val="0"/>
+              <w:spacing w:after="12" w:line="240" w:lineRule="auto"/>
+              <w:ind w:left="187" w:hanging="130"/>
             </w:pPr>
             <w:r>
               <w:rPr>
                 <w:rFonts w:ascii="Arial" w:hAnsi="Arial"/>
                 <w:b/>
-                <w:color w:val="2E6BE6"/>
-                <w:sz w:val="14"/>
+                <w:i w:val="0"/>
+                <w:color w:val="009076"/>
+                <w:sz w:val="16"/>
               </w:rPr>
               <w:t xml:space="preserve">• </w:t>
             </w:r>
             <w:r>
               <w:rPr>
                 <w:rFonts w:ascii="Arial" w:hAnsi="Arial"/>
-                <w:color w:val="071C3D"/>
-                <w:sz w:val="14"/>
+                <w:b w:val="0"/>
+                <w:i w:val="0"/>
+                <w:color w:val="203550"/>
+                <w:sz w:val="16"/>
               </w:rPr>
               <w:t>Verantwoordelijk voor maand-, kwartaal- en jaarafsluitingen van de Nederlandse entiteit binnen een internationale mobiliteitsgroep.</w:t>
             </w:r>
           </w:p>
           <w:p>
             <w:pPr>
-              <w:spacing w:after="9" w:line="240" w:lineRule="auto"/>
-              <w:ind w:left="187" w:hanging="115"/>
+              <w:keepNext w:val="0"/>
+              <w:keepLines w:val="0"/>
+              <w:spacing w:after="12" w:line="240" w:lineRule="auto"/>
+              <w:ind w:left="187" w:hanging="130"/>
             </w:pPr>
             <w:r>
               <w:rPr>
                 <w:rFonts w:ascii="Arial" w:hAnsi="Arial"/>
                 <w:b/>
-                <w:color w:val="2E6BE6"/>
-                <w:sz w:val="14"/>
+                <w:i w:val="0"/>
+                <w:color w:val="009076"/>
+                <w:sz w:val="16"/>
               </w:rPr>
               <w:t xml:space="preserve">• </w:t>
             </w:r>
             <w:r>
               <w:rPr>
                 <w:rFonts w:ascii="Arial" w:hAnsi="Arial"/>
-                <w:color w:val="071C3D"/>
-                <w:sz w:val="14"/>
+                <w:b w:val="0"/>
+                <w:i w:val="0"/>
+                <w:color w:val="203550"/>
+                <w:sz w:val="16"/>
               </w:rPr>
-              <w:t>Opgesteld en verbeterd managementrapportages voor directie en commerciële teams, inclusief omzet-, marge- en KPI-analyses.</w:t>
+              <w:t>Verbetert managementrapportages voor directie en commerciële teams, inclusief omzet-, marge- en KPI-analyses.</w:t>
             </w:r>
           </w:p>
           <w:p>
             <w:pPr>
-              <w:spacing w:after="9" w:line="240" w:lineRule="auto"/>
-              <w:ind w:left="187" w:hanging="115"/>
+              <w:keepNext w:val="0"/>
+              <w:keepLines w:val="0"/>
+              <w:spacing w:after="12" w:line="240" w:lineRule="auto"/>
+              <w:ind w:left="187" w:hanging="130"/>
             </w:pPr>
             <w:r>
               <w:rPr>
                 <w:rFonts w:ascii="Arial" w:hAnsi="Arial"/>
                 <w:b/>
-                <w:color w:val="2E6BE6"/>
-                <w:sz w:val="14"/>
+                <w:i w:val="0"/>
+                <w:color w:val="009076"/>
+                <w:sz w:val="16"/>
               </w:rPr>
               <w:t xml:space="preserve">• </w:t>
             </w:r>
             <w:r>
               <w:rPr>
                 <w:rFonts w:ascii="Arial" w:hAnsi="Arial"/>
-                <w:color w:val="071C3D"/>
-                <w:sz w:val="14"/>
+                <w:b w:val="0"/>
+                <w:i w:val="0"/>
+                <w:color w:val="203550"/>
+                <w:sz w:val="16"/>
               </w:rPr>
-              <w:t>Coördineert jaarlijkse budgetcyclus en rolling forecast; bespreekt afwijkingen en scenario's met budgethouders.</w:t>
+              <w:t>Coördineert budgetcyclus en rolling forecast en bespreekt afwijkingen, scenario's en acties met budgethouders.</w:t>
             </w:r>
           </w:p>
           <w:p>
             <w:pPr>
-              <w:spacing w:after="2"/>
-            </w:pPr>
-          </w:p>
-          <w:p>
-            <w:pPr>
-              <w:spacing w:after="4"/>
+              <w:keepNext w:val="0"/>
+              <w:keepLines w:val="0"/>
+              <w:spacing w:after="12" w:line="240" w:lineRule="auto"/>
+              <w:ind w:left="187" w:hanging="130"/>
             </w:pPr>
             <w:r>
               <w:rPr>
                 <w:rFonts w:ascii="Arial" w:hAnsi="Arial"/>
                 <w:b/>
-                <w:color w:val="071C3D"/>
+                <w:i w:val="0"/>
+                <w:color w:val="009076"/>
                 <w:sz w:val="16"/>
+              </w:rPr>
+              <w:t xml:space="preserve">• </w:t>
+            </w:r>
+            <w:r>
+              <w:rPr>
+                <w:rFonts w:ascii="Arial" w:hAnsi="Arial"/>
+                <w:b w:val="0"/>
+                <w:i w:val="0"/>
+                <w:color w:val="203550"/>
+                <w:sz w:val="16"/>
+              </w:rPr>
+              <w:t>Bouwt rendementsmodellen voor nieuwe proposities en adviseert management over pricing en investeringsbesluiten.</w:t>
+            </w:r>
+          </w:p>
+          <w:p>
+            <w:pPr>
+              <w:spacing w:after="9"/>
+            </w:pPr>
+          </w:p>
+          <w:p>
+            <w:pPr>
+              <w:spacing w:after="5"/>
+            </w:pPr>
+            <w:r>
+              <w:rPr>
+                <w:rFonts w:ascii="Arial" w:hAnsi="Arial"/>
+                <w:b/>
+                <w:i w:val="0"/>
+                <w:color w:val="1B3C51"/>
+                <w:sz w:val="17"/>
               </w:rPr>
               <w:t>Business Controller</w:t>
             </w:r>
             <w:r>
               <w:rPr>
                 <w:rFonts w:ascii="Arial" w:hAnsi="Arial"/>
-                <w:color w:val="6D7890"/>
-                <w:sz w:val="13"/>
+                <w:b w:val="0"/>
+                <w:i w:val="0"/>
+                <w:color w:val="6A7882"/>
+                <w:sz w:val="15"/>
               </w:rPr>
-              <w:t xml:space="preserve">   2019 - 2022</w:t>
+              <w:t xml:space="preserve">  2019 - 2022</w:t>
             </w:r>
           </w:p>
           <w:p>
             <w:pPr>
-              <w:spacing w:after="14"/>
+              <w:spacing w:after="15"/>
             </w:pPr>
             <w:r>
               <w:rPr>
                 <w:rFonts w:ascii="Arial" w:hAnsi="Arial"/>
                 <w:b/>
-                <w:color w:val="2E6BE6"/>
-                <w:sz w:val="14"/>
+                <w:i w:val="0"/>
+                <w:color w:val="009076"/>
+                <w:sz w:val="15"/>
               </w:rPr>
               <w:t>GreenFleet Services N.V. - Nieuwegein</w:t>
             </w:r>
           </w:p>
           <w:p>
             <w:pPr>
-              <w:spacing w:after="9" w:line="240" w:lineRule="auto"/>
-              <w:ind w:left="187" w:hanging="115"/>
+              <w:keepNext w:val="0"/>
+              <w:keepLines w:val="0"/>
+              <w:spacing w:after="12" w:line="240" w:lineRule="auto"/>
+              <w:ind w:left="187" w:hanging="130"/>
             </w:pPr>
             <w:r>
               <w:rPr>
                 <w:rFonts w:ascii="Arial" w:hAnsi="Arial"/>
                 <w:b/>
-                <w:color w:val="2E6BE6"/>
-                <w:sz w:val="14"/>
+                <w:i w:val="0"/>
+                <w:color w:val="009076"/>
+                <w:sz w:val="16"/>
               </w:rPr>
               <w:t xml:space="preserve">• </w:t>
             </w:r>
             <w:r>
               <w:rPr>
                 <w:rFonts w:ascii="Arial" w:hAnsi="Arial"/>
-                <w:color w:val="071C3D"/>
-                <w:sz w:val="14"/>
+                <w:b w:val="0"/>
+                <w:i w:val="0"/>
+                <w:color w:val="203550"/>
+                <w:sz w:val="16"/>
               </w:rPr>
               <w:t>Businesspartner voor sales en operations met maandelijkse analyse van volume, omzet, brutomarge en klantprofitability.</w:t>
             </w:r>
           </w:p>
           <w:p>
             <w:pPr>
-              <w:spacing w:after="9" w:line="240" w:lineRule="auto"/>
-              <w:ind w:left="187" w:hanging="115"/>
+              <w:keepNext w:val="0"/>
+              <w:keepLines w:val="0"/>
+              <w:spacing w:after="12" w:line="240" w:lineRule="auto"/>
+              <w:ind w:left="187" w:hanging="130"/>
             </w:pPr>
             <w:r>
               <w:rPr>
                 <w:rFonts w:ascii="Arial" w:hAnsi="Arial"/>
                 <w:b/>
-                <w:color w:val="2E6BE6"/>
-                <w:sz w:val="14"/>
+                <w:i w:val="0"/>
+                <w:color w:val="009076"/>
+                <w:sz w:val="16"/>
               </w:rPr>
               <w:t xml:space="preserve">• </w:t>
             </w:r>
             <w:r>
               <w:rPr>
                 <w:rFonts w:ascii="Arial" w:hAnsi="Arial"/>
-                <w:color w:val="071C3D"/>
-                <w:sz w:val="14"/>
+                <w:b w:val="0"/>
+                <w:i w:val="0"/>
+                <w:color w:val="203550"/>
+                <w:sz w:val="16"/>
               </w:rPr>
-              <w:t>Verbeterde forecastproces van kwartaalmatig naar maandelijkse rolling forecast.</w:t>
+              <w:t>Introduceerde een maandelijkse rolling forecast en verbeterde de voorspelbaarheid van commerciële resultaten.</w:t>
             </w:r>
           </w:p>
           <w:p>
             <w:pPr>
-              <w:spacing w:after="9" w:line="240" w:lineRule="auto"/>
-              <w:ind w:left="187" w:hanging="115"/>
+              <w:keepNext w:val="0"/>
+              <w:keepLines w:val="0"/>
+              <w:spacing w:after="12" w:line="240" w:lineRule="auto"/>
+              <w:ind w:left="187" w:hanging="130"/>
             </w:pPr>
             <w:r>
               <w:rPr>
                 <w:rFonts w:ascii="Arial" w:hAnsi="Arial"/>
                 <w:b/>
-                <w:color w:val="2E6BE6"/>
-                <w:sz w:val="14"/>
+                <w:i w:val="0"/>
+                <w:color w:val="009076"/>
+                <w:sz w:val="16"/>
               </w:rPr>
               <w:t xml:space="preserve">• </w:t>
             </w:r>
             <w:r>
               <w:rPr>
                 <w:rFonts w:ascii="Arial" w:hAnsi="Arial"/>
-                <w:color w:val="071C3D"/>
-                <w:sz w:val="14"/>
+                <w:b w:val="0"/>
+                <w:i w:val="0"/>
+                <w:color w:val="203550"/>
+                <w:sz w:val="16"/>
               </w:rPr>
-              <w:t>Ontwikkelde Power BI-dashboard voor commerciële prestaties en stuurde verbeteracties op basis van afwijkingsanalyses.</w:t>
+              <w:t>Ontwikkelde Power BI-stuurinformatie en ondersteunde businesscases voor nieuwe diensten en regio's.</w:t>
             </w:r>
           </w:p>
           <w:p>
             <w:pPr>
-              <w:spacing w:after="2"/>
+              <w:spacing w:after="9"/>
             </w:pPr>
           </w:p>
           <w:p>
             <w:pPr>
-              <w:spacing w:after="4"/>
+              <w:spacing w:after="5"/>
             </w:pPr>
             <w:r>
               <w:rPr>
                 <w:rFonts w:ascii="Arial" w:hAnsi="Arial"/>
                 <w:b/>
-                <w:color w:val="071C3D"/>
-                <w:sz w:val="16"/>
+                <w:i w:val="0"/>
+                <w:color w:val="1B3C51"/>
+                <w:sz w:val="17"/>
               </w:rPr>
               <w:t>Financial Controller</w:t>
             </w:r>
             <w:r>
               <w:rPr>
                 <w:rFonts w:ascii="Arial" w:hAnsi="Arial"/>
-                <w:color w:val="6D7890"/>
-                <w:sz w:val="13"/>
+                <w:b w:val="0"/>
+                <w:i w:val="0"/>
+                <w:color w:val="6A7882"/>
+                <w:sz w:val="15"/>
               </w:rPr>
-              <w:t xml:space="preserve">   2016 - 2019</w:t>
+              <w:t xml:space="preserve">  2016 - 2019</w:t>
             </w:r>
           </w:p>
           <w:p>
             <w:pPr>
-              <w:spacing w:after="14"/>
+              <w:spacing w:after="15"/>
             </w:pPr>
             <w:r>
               <w:rPr>
                 <w:rFonts w:ascii="Arial" w:hAnsi="Arial"/>
                 <w:b/>
-                <w:color w:val="2E6BE6"/>
-                <w:sz w:val="14"/>
+                <w:i w:val="0"/>
+                <w:color w:val="009076"/>
+                <w:sz w:val="15"/>
               </w:rPr>
               <w:t>Nordex Consumer Finance B.V. - Amersfoort</w:t>
             </w:r>
           </w:p>
           <w:p>
             <w:pPr>
-              <w:spacing w:after="9" w:line="240" w:lineRule="auto"/>
-              <w:ind w:left="187" w:hanging="115"/>
+              <w:keepNext w:val="0"/>
+              <w:keepLines w:val="0"/>
+              <w:spacing w:after="12" w:line="240" w:lineRule="auto"/>
+              <w:ind w:left="187" w:hanging="130"/>
             </w:pPr>
             <w:r>
               <w:rPr>
                 <w:rFonts w:ascii="Arial" w:hAnsi="Arial"/>
                 <w:b/>
-                <w:color w:val="2E6BE6"/>
-                <w:sz w:val="14"/>
+                <w:i w:val="0"/>
+                <w:color w:val="009076"/>
+                <w:sz w:val="16"/>
               </w:rPr>
               <w:t xml:space="preserve">• </w:t>
             </w:r>
             <w:r>
               <w:rPr>
                 <w:rFonts w:ascii="Arial" w:hAnsi="Arial"/>
-                <w:color w:val="071C3D"/>
-                <w:sz w:val="14"/>
+                <w:b w:val="0"/>
+                <w:i w:val="0"/>
+                <w:color w:val="203550"/>
+                <w:sz w:val="16"/>
               </w:rPr>
-              <w:t>Uitvoering en review van balansspecificaties, journaalposten, accruals en intercompany-aansluitingen.</w:t>
+              <w:t>Reviewde balansspecificaties, accruals, intercompany-aansluitingen en maandafsluiting.</w:t>
             </w:r>
           </w:p>
           <w:p>
             <w:pPr>
-              <w:spacing w:after="9" w:line="240" w:lineRule="auto"/>
-              <w:ind w:left="187" w:hanging="115"/>
+              <w:keepNext w:val="0"/>
+              <w:keepLines w:val="0"/>
+              <w:spacing w:after="12" w:line="240" w:lineRule="auto"/>
+              <w:ind w:left="187" w:hanging="130"/>
             </w:pPr>
             <w:r>
               <w:rPr>
                 <w:rFonts w:ascii="Arial" w:hAnsi="Arial"/>
                 <w:b/>
-                <w:color w:val="2E6BE6"/>
-                <w:sz w:val="14"/>
+                <w:i w:val="0"/>
+                <w:color w:val="009076"/>
+                <w:sz w:val="16"/>
               </w:rPr>
               <w:t xml:space="preserve">• </w:t>
             </w:r>
             <w:r>
               <w:rPr>
                 <w:rFonts w:ascii="Arial" w:hAnsi="Arial"/>
-                <w:color w:val="071C3D"/>
-                <w:sz w:val="14"/>
+                <w:b w:val="0"/>
+                <w:i w:val="0"/>
+                <w:color w:val="203550"/>
+                <w:sz w:val="16"/>
               </w:rPr>
-              <w:t>Ondersteunde Dutch GAAP-jaarrekening en auditplanning.</w:t>
+              <w:t>Ondersteunde Dutch GAAP-jaarrekening, auditplanning en financiële rapportages.</w:t>
             </w:r>
           </w:p>
           <w:p>
             <w:pPr>
-              <w:spacing w:after="9" w:line="240" w:lineRule="auto"/>
-              <w:ind w:left="187" w:hanging="115"/>
+              <w:keepNext w:val="0"/>
+              <w:keepLines w:val="0"/>
+              <w:spacing w:after="12" w:line="240" w:lineRule="auto"/>
+              <w:ind w:left="187" w:hanging="130"/>
             </w:pPr>
             <w:r>
               <w:rPr>
                 <w:rFonts w:ascii="Arial" w:hAnsi="Arial"/>
                 <w:b/>
-                <w:color w:val="2E6BE6"/>
-                <w:sz w:val="14"/>
+                <w:i w:val="0"/>
+                <w:color w:val="009076"/>
+                <w:sz w:val="16"/>
               </w:rPr>
               <w:t xml:space="preserve">• </w:t>
             </w:r>
             <w:r>
               <w:rPr>
                 <w:rFonts w:ascii="Arial" w:hAnsi="Arial"/>
-                <w:color w:val="071C3D"/>
-                <w:sz w:val="14"/>
+                <w:b w:val="0"/>
+                <w:i w:val="0"/>
+                <w:color w:val="203550"/>
+                <w:sz w:val="16"/>
               </w:rPr>
               <w:t>Automatiseerde periodieke rapportages in Excel en verkortte de maandafsluiting met twee werkdagen.</w:t>
             </w:r>
           </w:p>
           <w:p>
             <w:pPr>
-              <w:spacing w:after="2"/>
-            </w:pPr>
-          </w:p>
-          <w:p>
-            <w:pPr>
-              <w:spacing w:after="60"/>
+              <w:spacing w:before="20" w:after="62" w:line="240" w:lineRule="auto"/>
               <w:pBdr>
-                <w:bottom w:val="single" w:sz="4" w:space="1" w:color="D6DDEA"/>
+                <w:bottom w:val="single" w:sz="5" w:space="1" w:color="A7D9CF"/>
               </w:pBdr>
             </w:pPr>
           </w:p>
           <w:p>
             <w:pPr>
-              <w:spacing w:before="40" w:after="60"/>
+              <w:keepNext w:val="0"/>
+              <w:spacing w:before="20" w:after="50"/>
             </w:pPr>
             <w:r>
               <w:rPr>
                 <w:rFonts w:ascii="Arial" w:hAnsi="Arial"/>
                 <w:b/>
-                <w:color w:val="071C3D"/>
+                <w:i w:val="0"/>
+                <w:color w:val="1B3C51"/>
                 <w:sz w:val="17"/>
               </w:rPr>
-              <w:t>OPLEIDING</w:t>
+              <w:t>GESELECTEERDE RESULTATEN</w:t>
             </w:r>
           </w:p>
           <w:p>
             <w:pPr>
-              <w:spacing w:after="6"/>
+              <w:keepNext w:val="0"/>
+              <w:keepLines w:val="0"/>
+              <w:spacing w:after="12" w:line="240" w:lineRule="auto"/>
+              <w:ind w:left="187" w:hanging="130"/>
             </w:pPr>
             <w:r>
               <w:rPr>
                 <w:rFonts w:ascii="Arial" w:hAnsi="Arial"/>
                 <w:b/>
-                <w:color w:val="071C3D"/>
-                <w:sz w:val="14"/>
+                <w:i w:val="0"/>
+                <w:color w:val="009076"/>
+                <w:sz w:val="16"/>
+              </w:rPr>
+              <w:t xml:space="preserve">• </w:t>
+            </w:r>
+            <w:r>
+              <w:rPr>
+                <w:rFonts w:ascii="Arial" w:hAnsi="Arial"/>
+                <w:b w:val="0"/>
+                <w:i w:val="0"/>
+                <w:color w:val="203550"/>
+                <w:sz w:val="16"/>
+              </w:rPr>
+              <w:t>Maandafsluiting met twee werkdagen verkort door rapportage-automatisering.</w:t>
+            </w:r>
+          </w:p>
+          <w:p>
+            <w:pPr>
+              <w:keepNext w:val="0"/>
+              <w:keepLines w:val="0"/>
+              <w:spacing w:after="12" w:line="240" w:lineRule="auto"/>
+              <w:ind w:left="187" w:hanging="130"/>
+            </w:pPr>
+            <w:r>
+              <w:rPr>
+                <w:rFonts w:ascii="Arial" w:hAnsi="Arial"/>
+                <w:b/>
+                <w:i w:val="0"/>
+                <w:color w:val="009076"/>
+                <w:sz w:val="16"/>
+              </w:rPr>
+              <w:t xml:space="preserve">• </w:t>
+            </w:r>
+            <w:r>
+              <w:rPr>
+                <w:rFonts w:ascii="Arial" w:hAnsi="Arial"/>
+                <w:b w:val="0"/>
+                <w:i w:val="0"/>
+                <w:color w:val="203550"/>
+                <w:sz w:val="16"/>
+              </w:rPr>
+              <w:t>Commerciële stuurinformatie ontwikkeld voor marge, omzet en KPI's.</w:t>
+            </w:r>
+          </w:p>
+          <w:p>
+            <w:pPr>
+              <w:keepNext w:val="0"/>
+              <w:keepLines w:val="0"/>
+              <w:spacing w:after="12" w:line="240" w:lineRule="auto"/>
+              <w:ind w:left="187" w:hanging="130"/>
+            </w:pPr>
+            <w:r>
+              <w:rPr>
+                <w:rFonts w:ascii="Arial" w:hAnsi="Arial"/>
+                <w:b/>
+                <w:i w:val="0"/>
+                <w:color w:val="009076"/>
+                <w:sz w:val="16"/>
+              </w:rPr>
+              <w:t xml:space="preserve">• </w:t>
+            </w:r>
+            <w:r>
+              <w:rPr>
+                <w:rFonts w:ascii="Arial" w:hAnsi="Arial"/>
+                <w:b w:val="0"/>
+                <w:i w:val="0"/>
+                <w:color w:val="203550"/>
+                <w:sz w:val="16"/>
+              </w:rPr>
+              <w:t>Forecastingproces aangescherpt naar een maandelijkse rolling forecast.</w:t>
+            </w:r>
+          </w:p>
+          <w:p>
+            <w:pPr>
+              <w:keepNext w:val="0"/>
+              <w:spacing w:before="20" w:after="50"/>
+            </w:pPr>
+            <w:r>
+              <w:rPr>
+                <w:rFonts w:ascii="Arial" w:hAnsi="Arial"/>
+                <w:b/>
+                <w:i w:val="0"/>
+                <w:color w:val="1B3C51"/>
+                <w:sz w:val="17"/>
+              </w:rPr>
+              <w:t>CONTROL &amp; COMPLIANCE</w:t>
+            </w:r>
+          </w:p>
+          <w:p>
+            <w:pPr>
+              <w:keepNext w:val="0"/>
+              <w:keepLines w:val="0"/>
+              <w:spacing w:after="11" w:line="240" w:lineRule="auto"/>
+              <w:ind w:left="187" w:hanging="130"/>
+            </w:pPr>
+            <w:r>
+              <w:rPr>
+                <w:rFonts w:ascii="Arial" w:hAnsi="Arial"/>
+                <w:b/>
+                <w:i w:val="0"/>
+                <w:color w:val="009076"/>
+                <w:sz w:val="16"/>
+              </w:rPr>
+              <w:t xml:space="preserve">• </w:t>
+            </w:r>
+            <w:r>
+              <w:rPr>
+                <w:rFonts w:ascii="Arial" w:hAnsi="Arial"/>
+                <w:b w:val="0"/>
+                <w:i w:val="0"/>
+                <w:color w:val="203550"/>
+                <w:sz w:val="16"/>
+              </w:rPr>
+              <w:t>Aanspreekpunt voor externe accountant, jaarrekeningdossier en interne control-documentatie.</w:t>
+            </w:r>
+          </w:p>
+          <w:p>
+            <w:pPr>
+              <w:keepNext w:val="0"/>
+              <w:keepLines w:val="0"/>
+              <w:spacing w:after="11" w:line="240" w:lineRule="auto"/>
+              <w:ind w:left="187" w:hanging="130"/>
+            </w:pPr>
+            <w:r>
+              <w:rPr>
+                <w:rFonts w:ascii="Arial" w:hAnsi="Arial"/>
+                <w:b/>
+                <w:i w:val="0"/>
+                <w:color w:val="009076"/>
+                <w:sz w:val="16"/>
+              </w:rPr>
+              <w:t xml:space="preserve">• </w:t>
+            </w:r>
+            <w:r>
+              <w:rPr>
+                <w:rFonts w:ascii="Arial" w:hAnsi="Arial"/>
+                <w:b w:val="0"/>
+                <w:i w:val="0"/>
+                <w:color w:val="203550"/>
+                <w:sz w:val="16"/>
+              </w:rPr>
+              <w:t>Periodieke afstemming met group finance over rapportagekalender en accountingvraagstukken.</w:t>
+            </w:r>
+          </w:p>
+          <w:p>
+            <w:pPr>
+              <w:spacing w:before="20" w:after="56" w:line="240" w:lineRule="auto"/>
+              <w:pBdr>
+                <w:bottom w:val="single" w:sz="5" w:space="1" w:color="A7D9CF"/>
+              </w:pBdr>
+            </w:pPr>
+          </w:p>
+          <w:p>
+            <w:pPr>
+              <w:keepNext w:val="0"/>
+              <w:spacing w:before="20" w:after="50"/>
+            </w:pPr>
+            <w:r>
+              <w:rPr>
+                <w:rFonts w:ascii="Arial" w:hAnsi="Arial"/>
+                <w:b/>
+                <w:i w:val="0"/>
+                <w:color w:val="1B3C51"/>
+                <w:sz w:val="17"/>
+              </w:rPr>
+              <w:t>OPLEIDING &amp; TRAINING</w:t>
+            </w:r>
+          </w:p>
+          <w:p>
+            <w:pPr>
+              <w:spacing w:after="11"/>
+            </w:pPr>
+            <w:r>
+              <w:rPr>
+                <w:rFonts w:ascii="Arial" w:hAnsi="Arial"/>
+                <w:b/>
+                <w:i w:val="0"/>
+                <w:color w:val="203550"/>
+                <w:sz w:val="16"/>
               </w:rPr>
               <w:t>MSc Finance</w:t>
             </w:r>
             <w:r>
               <w:rPr>
                 <w:rFonts w:ascii="Arial" w:hAnsi="Arial"/>
-                <w:color w:val="5F6B85"/>
-                <w:sz w:val="14"/>
+                <w:b w:val="0"/>
+                <w:i w:val="0"/>
+                <w:color w:val="6A7882"/>
+                <w:sz w:val="15"/>
               </w:rPr>
-              <w:t xml:space="preserve"> - Tilburg University (2014 - 2016)</w:t>
+              <w:t xml:space="preserve"> - Tilburg University | 2014 - 2016</w:t>
             </w:r>
           </w:p>
           <w:p>
             <w:pPr>
-              <w:spacing w:after="6"/>
+              <w:spacing w:after="11"/>
             </w:pPr>
             <w:r>
               <w:rPr>
                 <w:rFonts w:ascii="Arial" w:hAnsi="Arial"/>
                 <w:b/>
-                <w:color w:val="071C3D"/>
-                <w:sz w:val="14"/>
+                <w:i w:val="0"/>
+                <w:color w:val="203550"/>
+                <w:sz w:val="16"/>
               </w:rPr>
               <w:t>BSc Bedrijfseconomie</w:t>
             </w:r>
             <w:r>
               <w:rPr>
                 <w:rFonts w:ascii="Arial" w:hAnsi="Arial"/>
-                <w:color w:val="5F6B85"/>
-                <w:sz w:val="14"/>
+                <w:b w:val="0"/>
+                <w:i w:val="0"/>
+                <w:color w:val="6A7882"/>
+                <w:sz w:val="15"/>
               </w:rPr>
-              <w:t xml:space="preserve"> - Universiteit Utrecht (2011 - 2014)</w:t>
+              <w:t xml:space="preserve"> - Universiteit Utrecht | 2011 - 2014</w:t>
             </w:r>
           </w:p>
           <w:p>
             <w:pPr>
-              <w:spacing w:before="40" w:after="60"/>
+              <w:keepNext w:val="0"/>
+              <w:keepLines w:val="0"/>
+              <w:spacing w:after="9" w:line="240" w:lineRule="auto"/>
+              <w:ind w:left="187" w:hanging="130"/>
             </w:pPr>
             <w:r>
               <w:rPr>
                 <w:rFonts w:ascii="Arial" w:hAnsi="Arial"/>
                 <w:b/>
-                <w:color w:val="071C3D"/>
-                <w:sz w:val="16"/>
-              </w:rPr>
-              <w:t>AANVULLEND</w:t>
-            </w:r>
-          </w:p>
-          <w:p>
-            <w:pPr>
-              <w:spacing w:after="8" w:line="240" w:lineRule="auto"/>
-              <w:ind w:left="187" w:hanging="115"/>
-            </w:pPr>
-            <w:r>
-              <w:rPr>
-                <w:rFonts w:ascii="Arial" w:hAnsi="Arial"/>
-                <w:b/>
-                <w:color w:val="2E6BE6"/>
-                <w:sz w:val="14"/>
+                <w:i w:val="0"/>
+                <w:color w:val="009076"/>
+                <w:sz w:val="15"/>
               </w:rPr>
               <w:t xml:space="preserve">• </w:t>
             </w:r>
             <w:r>
               <w:rPr>
                 <w:rFonts w:ascii="Arial" w:hAnsi="Arial"/>
-                <w:color w:val="071C3D"/>
-                <w:sz w:val="14"/>
+                <w:b w:val="0"/>
+                <w:i w:val="0"/>
+                <w:color w:val="203550"/>
+                <w:sz w:val="15"/>
               </w:rPr>
-              <w:t>Beschikbaar voor 36-40 uur</w:t>
+              <w:t>Register Controller - modules Financial Reporting &amp; Control (2021-2022)</w:t>
             </w:r>
           </w:p>
           <w:p>
             <w:pPr>
-              <w:spacing w:after="8" w:line="240" w:lineRule="auto"/>
-              <w:ind w:left="187" w:hanging="115"/>
+              <w:keepNext w:val="0"/>
+              <w:keepLines w:val="0"/>
+              <w:spacing w:after="9" w:line="240" w:lineRule="auto"/>
+              <w:ind w:left="187" w:hanging="130"/>
             </w:pPr>
             <w:r>
               <w:rPr>
                 <w:rFonts w:ascii="Arial" w:hAnsi="Arial"/>
                 <w:b/>
-                <w:color w:val="2E6BE6"/>
-                <w:sz w:val="14"/>
+                <w:i w:val="0"/>
+                <w:color w:val="009076"/>
+                <w:sz w:val="15"/>
               </w:rPr>
               <w:t xml:space="preserve">• </w:t>
             </w:r>
             <w:r>
               <w:rPr>
                 <w:rFonts w:ascii="Arial" w:hAnsi="Arial"/>
-                <w:color w:val="071C3D"/>
-                <w:sz w:val="14"/>
+                <w:b w:val="0"/>
+                <w:i w:val="0"/>
+                <w:color w:val="203550"/>
+                <w:sz w:val="15"/>
               </w:rPr>
-              <w:t>Hybride werken passend</w:t>
+              <w:t>Power BI for Finance (2020)</w:t>
             </w:r>
           </w:p>
           <w:p>
             <w:pPr>
-              <w:spacing w:after="8" w:line="240" w:lineRule="auto"/>
-              <w:ind w:left="187" w:hanging="115"/>
+              <w:keepNext w:val="0"/>
+              <w:spacing w:before="20" w:after="50"/>
             </w:pPr>
             <w:r>
               <w:rPr>
                 <w:rFonts w:ascii="Arial" w:hAnsi="Arial"/>
                 <w:b/>
-                <w:color w:val="2E6BE6"/>
-                <w:sz w:val="14"/>
+                <w:i w:val="0"/>
+                <w:color w:val="1B3C51"/>
+                <w:sz w:val="17"/>
               </w:rPr>
-              <w:t xml:space="preserve">• </w:t>
+              <w:t>BESCHIKBAARHEID</w:t>
             </w:r>
+          </w:p>
+          <w:p>
+            <w:pPr>
+              <w:spacing w:after="0"/>
+            </w:pPr>
             <w:r>
               <w:rPr>
                 <w:rFonts w:ascii="Arial" w:hAnsi="Arial"/>
-                <w:color w:val="071C3D"/>
-                <w:sz w:val="14"/>
+                <w:b w:val="0"/>
+                <w:i w:val="0"/>
+                <w:color w:val="6A7882"/>
+                <w:sz w:val="15"/>
               </w:rPr>
-              <w:t>Register Controller opleiding - modules Financial Reporting &amp; Control (2021-2022)</w:t>
+              <w:t>36-40 uur | hybride | regio Utrecht / Amersfoort</w:t>
             </w:r>
           </w:p>
         </w:tc>
       </w:tr>
     </w:tbl>
+    <w:p>
+      <w:pPr>
+        <w:spacing w:before="0" w:after="0" w:line="240" w:lineRule="auto"/>
+      </w:pPr>
+      <w:r>
+        <w:rPr>
+          <w:rFonts w:ascii="Arial" w:hAnsi="Arial"/>
+          <w:b w:val="0"/>
+          <w:i w:val="0"/>
+          <w:color w:val="FFFFFF"/>
+          <w:sz w:val="2"/>
+        </w:rPr>
+        <w:t xml:space="preserve"> </w:t>
+      </w:r>
+    </w:p>
     <w:sectPr>
-      <w:headerReference w:type="default" r:id="rId9"/>
-      <w:footerReference w:type="default" r:id="rId10"/>
+      <w:footerReference w:type="default" r:id="rId9"/>
       <w:pgSz w:w="11909" w:h="16834"/>
-      <w:pgMar w:top="490" w:right="490" w:bottom="490" w:left="490" w:header="720" w:footer="720" w:gutter="0"/>
+      <w:pgMar w:top="432" w:right="490" w:bottom="432" w:left="490" w:header="144" w:footer="144" w:gutter="0"/>
       <w:cols w:space="720"/>
       <w:docGrid w:linePitch="360"/>
     </w:sectPr>
@@ -942,39 +1644,9 @@
   <w:p>
     <w:pPr>
       <w:pStyle w:val="Footer"/>
-      <w:jc w:val="center"/>
-    </w:pPr>
-    <w:r>
-      <w:rPr>
-        <w:rFonts w:ascii="Arial" w:hAnsi="Arial"/>
-        <w:color w:val="7B8499"/>
-        <w:sz w:val="15"/>
-      </w:rPr>
-      <w:t>Bluefin demo - Senior Controller - Lease a Bike, Amersfoort - synthetisch kandidaatprofiel</w:t>
-    </w:r>
+    </w:pPr>
   </w:p>
 </w:ftr>
-</file>
-
-<file path=word/header1.xml><?xml version="1.0" encoding="utf-8"?>
-<w:hdr xmlns:m="http://schemas.openxmlformats.org/officeDocument/2006/math" xmlns:mc="http://schemas.openxmlformats.org/markup-compatibility/2006" xmlns:mo="http://schemas.microsoft.com/office/mac/office/2008/main" xmlns:mv="urn:schemas-microsoft-com:mac:vml" xmlns:o="urn:schemas-microsoft-com:office:office" xmlns:r="http://schemas.openxmlformats.org/officeDocument/2006/relationships" xmlns:v="urn:schemas-microsoft-com:vml" xmlns:w10="urn:schemas-microsoft-com:office:word" xmlns:w14="http://schemas.microsoft.com/office/word/2010/wordml" xmlns:w="http://schemas.openxmlformats.org/wordprocessingml/2006/main" xmlns:wne="http://schemas.microsoft.com/office/word/2006/wordml" xmlns:wp14="http://schemas.microsoft.com/office/word/2010/wordprocessingDrawing" xmlns:wp="http://schemas.openxmlformats.org/drawingml/2006/wordprocessingDrawing" xmlns:wpc="http://schemas.microsoft.com/office/word/2010/wordprocessingCanvas" xmlns:wpg="http://schemas.microsoft.com/office/word/2010/wordprocessingGroup" xmlns:wpi="http://schemas.microsoft.com/office/word/2010/wordprocessingInk" xmlns:wps="http://schemas.microsoft.com/office/word/2010/wordprocessingShape" mc:Ignorable="w14 wp14">
-  <w:p>
-    <w:pPr>
-      <w:pStyle w:val="Header"/>
-      <w:spacing w:after="0"/>
-      <w:jc w:val="right"/>
-    </w:pPr>
-    <w:r>
-      <w:rPr>
-        <w:rFonts w:ascii="Arial" w:hAnsi="Arial"/>
-        <w:b/>
-        <w:color w:val="071C3D"/>
-        <w:sz w:val="22"/>
-      </w:rPr>
-      <w:t>bluefin</w:t>
-    </w:r>
-  </w:p>
-</w:hdr>
 </file>
 
 <file path=word/numbering.xml><?xml version="1.0" encoding="utf-8"?>

</xml_diff>